<commit_message>
SASTT-6 Define grouped evaluation and source-grounded scoring
Make connected speaker/customer splits explicit, separate objection and action scoring from evidence precision, define empty cases and comparable manual/application conditions. Align acceptance criteria and the black-only 14-page report with 17-page appendices. Public UCI profiling reproduced the recorded counts and hashes; model and user-study results remain future work.

Task: https://sales-analytics-stt-team.youtrack.cloud/issue/SASTT-6
</commit_message>
<xml_diff>
--- a/docs/research_and_design.docx
+++ b/docs/research_and_design.docx
@@ -2037,7 +2037,7 @@
                 <w:color w:val="000000"/>
                 <w:sz w:val="18"/>
               </w:rPr>
-              <w:t>Pseudo labels improve ROUGE but can worsen factuality; grammatical acceptability does not ensure grounding.</w:t>
+              <w:t>Pseudo-only training raises ROUGE but lowers automatic FactCC on DialogSum; grammatical acceptability does not ensure grounding.</w:t>
             </w:r>
           </w:p>
         </w:tc>
@@ -3428,7 +3428,7 @@
         <w:rPr>
           <w:color w:val="000000"/>
         </w:rPr>
-        <w:t>The summarization studies support retrieving evidence before producing a highlight and letting a person correct it [L05–L08]. In the sales-call paper, a model with higher ROUGE could still be less factual. We will therefore measure supporting evidence and numeric commitments, rather than relying on fluency or text overlap alone.</w:t>
+        <w:t>The summarization studies support retrieving evidence before producing a highlight and letting a person correct it [L05–L08]. In the sales-call paper, pseudo-only training raises ROUGE but lowers automatic FactCC on DialogSum; this is not a human truth audit. We will check source evidence and numeric commitments separately from fluency or text overlap.</w:t>
       </w:r>
     </w:p>
     <w:p>
@@ -9471,7 +9471,7 @@
                 <w:color w:val="000000"/>
                 <w:sz w:val="19"/>
               </w:rPr>
-              <w:t>Evidence precision ≥95%; zero fabricated numeric commitments in the reviewed held-out sample. T08</w:t>
+              <w:t>Raw evidence precision ≥95% against source audio/gold; report empty output and recall. Zero fabricated numeric commitments after human review. T08</w:t>
             </w:r>
           </w:p>
         </w:tc>
@@ -9724,7 +9724,7 @@
         <w:rPr>
           <w:color w:val="000000"/>
         </w:rPr>
-        <w:t>The main review scenario is: open a completed call, inspect the timestamped evidence, correct an interpretation, and confirm the result. If transcription fails, the user sees a useful status and a recovery action; the CRM outcome remains unchanged.</w:t>
+        <w:t>The main review scenario is: open a completed call, inspect timestamped evidence, correct an objection interpretation and confirm that item. The next action stays a draft until separately reviewed. Failed processing exposes a recovery action and never changes the CRM outcome.</w:t>
       </w:r>
     </w:p>
     <w:p>
@@ -10170,7 +10170,7 @@
                 <w:color w:val="000000"/>
                 <w:sz w:val="19"/>
               </w:rPr>
-              <w:t>Macro F1 ≥0.75, evidence precision ≥0.95 and zero fabricated numeric commitments in the reviewed test sample.</w:t>
+              <w:t>Objection macro F1 ≥0.75 and action-event F1 ≥0.75, separately; raw evidence precision ≥0.95 against source truth. Zero fabricated numbers after human review.</w:t>
             </w:r>
           </w:p>
         </w:tc>
@@ -10400,7 +10400,7 @@
         <w:rPr>
           <w:color w:val="000000"/>
         </w:rPr>
-        <w:t>The feasibility target is 60 authorized calls: 20 mainly Russian, 20 mainly Kazakh and 20 mixed, about 2–15 minutes each. Use 30 development, 10 validation and 20 held-out test calls. Keep the same customer and speaker out of different partitions, preserve language coverage where feasible, and freeze the test manifest before tuning. If fewer calls are obtained, report the achieved size and narrower conclusions.</w:t>
+        <w:t>The feasibility target is 60 authorized calls: 20 mainly Russian, 20 mainly Kazakh and 20 mixed, about 2–15 minutes each. The 30/10/20 split is approximate: assign connected customer/speaker groups intact, then report achieved counts and missing strata. Four representatives may not permit the desired split. Obtain more independent groups or narrow the claim; never describe repeated-speaker partitions as speaker-independent. Freeze the manifest before tuning.</w:t>
       </w:r>
     </w:p>
     <w:p>
@@ -10408,7 +10408,7 @@
         <w:rPr>
           <w:color w:val="000000"/>
         </w:rPr>
-        <w:t>Two annotators will label the held-out material independently, record agreement and then resolve disagreements. Labels include objection category, next action and an explicit owner/date only where stated, with supporting turns. Report raw and normalized word error rate, rare-class counts, failures and uncertainty. Speaker role accuracy is separate from optional diarization error rate.</w:t>
+        <w:t>Two annotators label held-out material independently before adjudication. Report six binary objection-label agreement scores, event/field agreement and rare-class support. Score objections and next-action events separately; fix label and empty-output rules. Check factual support against audio or adjudicated gold, including ASR hallucinations. Appendix D defines matching, failed calls and grouped uncertainty.</w:t>
       </w:r>
     </w:p>
     <w:p>
@@ -10427,7 +10427,7 @@
         <w:rPr>
           <w:color w:val="000000"/>
         </w:rPr>
-        <w:t>Record model/runtime versions, decoding, hardware, channel, noise and audio duration. Measure ASR processing seconds divided by audio seconds, with warm-up and queue time reported separately. Usability tasks use a fixed import fixture, one preprocessed two-minute review call and a dashboard explanation; ASR waiting is excluded from the task-time target.</w:t>
+        <w:t>Record model/runtime versions, decoding, hardware and audio conditions. Report real-time factor with warm-up and queue time separately. The future integrated usability study uses two equivalent fixtures with counterbalanced manual/application order; compare common outputs. The present sample-only HTML import cannot pass the full CSV, queueing or authentication requirements.</w:t>
       </w:r>
     </w:p>
     <w:p>
@@ -11317,7 +11317,7 @@
         <w:rPr>
           <w:color w:val="000000"/>
         </w:rPr>
-        <w:t>Before package publication on 23 October, the private repository https://github.com/ddigreen/sales-analytics-stt contained its initial README only. Dameli had access; Bekzat’s invitation awaited acceptance. Later publication, access, reviews and tagging are tracked in GitHub. YouTrack and genuine task links were still pending. The initial commit alone does not satisfy the brief’s teamwork evidence.</w:t>
+        <w:t>On 23 October, the prepared package is published in draft PR 2 at https://github.com/ddigreen/sales-analytics-stt. YouTrack at https://sales-analytics-stt-team.youtrack.cloud/projects/SASTT has 12 assigned Open issues. Source checks, public-data reproduction and technical prototype checks are recorded; genuine student review, stakeholder evidence, supervisor feedback, reviewer access and the submission tag remain pending. Publication does not establish earlier progressive student development.</w:t>
       </w:r>
     </w:p>
     <w:p>
@@ -12528,6 +12528,9 @@
       </w:tabs>
       <w:spacing w:after="0" w:line="240" w:lineRule="auto"/>
     </w:pPr>
+    <w:rPr>
+      <w:color w:val="000000"/>
+    </w:rPr>
   </w:style>
   <w:style w:type="character" w:customStyle="1" w:styleId="HeaderChar">
     <w:name w:val="Header Char"/>
@@ -12535,6 +12538,9 @@
     <w:link w:val="Header"/>
     <w:uiPriority w:val="99"/>
     <w:rsid w:val="00E618BF"/>
+    <w:rPr>
+      <w:color w:val="000000"/>
+    </w:rPr>
   </w:style>
   <w:style w:type="paragraph" w:styleId="Footer">
     <w:name w:val="footer"/>
@@ -12550,6 +12556,9 @@
       </w:tabs>
       <w:spacing w:after="0" w:line="240" w:lineRule="auto"/>
     </w:pPr>
+    <w:rPr>
+      <w:color w:val="000000"/>
+    </w:rPr>
   </w:style>
   <w:style w:type="character" w:customStyle="1" w:styleId="FooterChar">
     <w:name w:val="Footer Char"/>
@@ -12557,6 +12566,9 @@
     <w:link w:val="Footer"/>
     <w:uiPriority w:val="99"/>
     <w:rsid w:val="00E618BF"/>
+    <w:rPr>
+      <w:color w:val="000000"/>
+    </w:rPr>
   </w:style>
   <w:style w:type="paragraph" w:styleId="Heading1">
     <w:name w:val="heading 1"/>
@@ -12772,6 +12784,9 @@
     <w:uiPriority w:val="1"/>
     <w:semiHidden/>
     <w:unhideWhenUsed/>
+    <w:rPr>
+      <w:color w:val="000000"/>
+    </w:rPr>
   </w:style>
   <w:style w:type="table" w:default="1" w:styleId="TableNormal">
     <w:name w:val="Normal Table"/>
@@ -12802,6 +12817,9 @@
     <w:pPr>
       <w:spacing w:after="0" w:line="240" w:lineRule="auto"/>
     </w:pPr>
+    <w:rPr>
+      <w:color w:val="000000"/>
+    </w:rPr>
   </w:style>
   <w:style w:type="character" w:customStyle="1" w:styleId="Heading1Char">
     <w:name w:val="Heading 1 Char"/>
@@ -12933,6 +12951,9 @@
       <w:ind w:left="720"/>
       <w:contextualSpacing/>
     </w:pPr>
+    <w:rPr>
+      <w:color w:val="000000"/>
+    </w:rPr>
   </w:style>
   <w:style w:type="paragraph" w:styleId="BodyText">
     <w:name w:val="Body Text"/>
@@ -12944,6 +12965,9 @@
     <w:pPr>
       <w:spacing w:after="120"/>
     </w:pPr>
+    <w:rPr>
+      <w:color w:val="000000"/>
+    </w:rPr>
   </w:style>
   <w:style w:type="character" w:customStyle="1" w:styleId="BodyTextChar">
     <w:name w:val="Body Text Char"/>
@@ -12951,6 +12975,9 @@
     <w:link w:val="BodyText"/>
     <w:uiPriority w:val="99"/>
     <w:rsid w:val="00AA1D8D"/>
+    <w:rPr>
+      <w:color w:val="000000"/>
+    </w:rPr>
   </w:style>
   <w:style w:type="paragraph" w:styleId="BodyText2">
     <w:name w:val="Body Text 2"/>
@@ -12962,6 +12989,9 @@
     <w:pPr>
       <w:spacing w:after="120" w:line="480" w:lineRule="auto"/>
     </w:pPr>
+    <w:rPr>
+      <w:color w:val="000000"/>
+    </w:rPr>
   </w:style>
   <w:style w:type="character" w:customStyle="1" w:styleId="BodyText2Char">
     <w:name w:val="Body Text 2 Char"/>
@@ -12969,6 +12999,9 @@
     <w:link w:val="BodyText2"/>
     <w:uiPriority w:val="99"/>
     <w:rsid w:val="00AA1D8D"/>
+    <w:rPr>
+      <w:color w:val="000000"/>
+    </w:rPr>
   </w:style>
   <w:style w:type="paragraph" w:styleId="BodyText3">
     <w:name w:val="Body Text 3"/>
@@ -12981,6 +13014,7 @@
       <w:spacing w:after="120"/>
     </w:pPr>
     <w:rPr>
+      <w:color w:val="000000"/>
       <w:sz w:val="16"/>
       <w:szCs w:val="16"/>
     </w:rPr>
@@ -12992,6 +13026,7 @@
     <w:uiPriority w:val="99"/>
     <w:rsid w:val="00AA1D8D"/>
     <w:rPr>
+      <w:color w:val="000000"/>
       <w:sz w:val="16"/>
       <w:szCs w:val="16"/>
     </w:rPr>
@@ -13006,6 +13041,9 @@
       <w:ind w:left="360" w:hanging="360"/>
       <w:contextualSpacing/>
     </w:pPr>
+    <w:rPr>
+      <w:color w:val="000000"/>
+    </w:rPr>
   </w:style>
   <w:style w:type="paragraph" w:styleId="List2">
     <w:name w:val="List 2"/>
@@ -13017,6 +13055,9 @@
       <w:ind w:left="720" w:hanging="360"/>
       <w:contextualSpacing/>
     </w:pPr>
+    <w:rPr>
+      <w:color w:val="000000"/>
+    </w:rPr>
   </w:style>
   <w:style w:type="paragraph" w:styleId="List3">
     <w:name w:val="List 3"/>
@@ -13028,6 +13069,9 @@
       <w:ind w:left="1080" w:hanging="360"/>
       <w:contextualSpacing/>
     </w:pPr>
+    <w:rPr>
+      <w:color w:val="000000"/>
+    </w:rPr>
   </w:style>
   <w:style w:type="paragraph" w:styleId="ListBullet">
     <w:name w:val="List Bullet"/>
@@ -13041,6 +13085,9 @@
       </w:numPr>
       <w:contextualSpacing/>
     </w:pPr>
+    <w:rPr>
+      <w:color w:val="000000"/>
+    </w:rPr>
   </w:style>
   <w:style w:type="paragraph" w:styleId="ListBullet2">
     <w:name w:val="List Bullet 2"/>
@@ -13054,6 +13101,9 @@
       </w:numPr>
       <w:contextualSpacing/>
     </w:pPr>
+    <w:rPr>
+      <w:color w:val="000000"/>
+    </w:rPr>
   </w:style>
   <w:style w:type="paragraph" w:styleId="ListBullet3">
     <w:name w:val="List Bullet 3"/>
@@ -13067,6 +13117,9 @@
       </w:numPr>
       <w:contextualSpacing/>
     </w:pPr>
+    <w:rPr>
+      <w:color w:val="000000"/>
+    </w:rPr>
   </w:style>
   <w:style w:type="paragraph" w:styleId="ListNumber">
     <w:name w:val="List Number"/>
@@ -13080,6 +13133,9 @@
       </w:numPr>
       <w:contextualSpacing/>
     </w:pPr>
+    <w:rPr>
+      <w:color w:val="000000"/>
+    </w:rPr>
   </w:style>
   <w:style w:type="paragraph" w:styleId="ListNumber2">
     <w:name w:val="List Number 2"/>
@@ -13093,6 +13149,9 @@
       </w:numPr>
       <w:contextualSpacing/>
     </w:pPr>
+    <w:rPr>
+      <w:color w:val="000000"/>
+    </w:rPr>
   </w:style>
   <w:style w:type="paragraph" w:styleId="ListNumber3">
     <w:name w:val="List Number 3"/>
@@ -13106,6 +13165,9 @@
       </w:numPr>
       <w:contextualSpacing/>
     </w:pPr>
+    <w:rPr>
+      <w:color w:val="000000"/>
+    </w:rPr>
   </w:style>
   <w:style w:type="paragraph" w:styleId="ListContinue">
     <w:name w:val="List Continue"/>
@@ -13118,6 +13180,9 @@
       <w:ind w:left="360"/>
       <w:contextualSpacing/>
     </w:pPr>
+    <w:rPr>
+      <w:color w:val="000000"/>
+    </w:rPr>
   </w:style>
   <w:style w:type="paragraph" w:styleId="ListContinue2">
     <w:name w:val="List Continue 2"/>
@@ -13130,6 +13195,9 @@
       <w:ind w:left="720"/>
       <w:contextualSpacing/>
     </w:pPr>
+    <w:rPr>
+      <w:color w:val="000000"/>
+    </w:rPr>
   </w:style>
   <w:style w:type="paragraph" w:styleId="ListContinue3">
     <w:name w:val="List Continue 3"/>
@@ -13142,6 +13210,9 @@
       <w:ind w:left="1080"/>
       <w:contextualSpacing/>
     </w:pPr>
+    <w:rPr>
+      <w:color w:val="000000"/>
+    </w:rPr>
   </w:style>
   <w:style w:type="paragraph" w:styleId="MacroText">
     <w:name w:val="macro"/>
@@ -13162,6 +13233,7 @@
     </w:pPr>
     <w:rPr>
       <w:rFonts w:ascii="Courier" w:hAnsi="Courier"/>
+      <w:color w:val="000000"/>
       <w:sz w:val="20"/>
       <w:szCs w:val="20"/>
     </w:rPr>
@@ -13174,6 +13246,7 @@
     <w:rsid w:val="0029639D"/>
     <w:rPr>
       <w:rFonts w:ascii="Courier" w:hAnsi="Courier"/>
+      <w:color w:val="000000"/>
       <w:sz w:val="20"/>
       <w:szCs w:val="20"/>
     </w:rPr>
@@ -13321,6 +13394,7 @@
     <w:rPr>
       <w:b/>
       <w:bCs/>
+      <w:color w:val="000000"/>
     </w:rPr>
   </w:style>
   <w:style w:type="character" w:styleId="Emphasis">
@@ -13332,6 +13406,7 @@
     <w:rPr>
       <w:i/>
       <w:iCs/>
+      <w:color w:val="000000"/>
     </w:rPr>
   </w:style>
   <w:style w:type="paragraph" w:styleId="IntenseQuote">
@@ -13431,6 +13506,7 @@
       <w:b/>
       <w:bCs/>
       <w:smallCaps/>
+      <w:color w:val="000000"/>
       <w:spacing w:val="5"/>
     </w:rPr>
   </w:style>
@@ -13446,6 +13522,9 @@
     <w:pPr>
       <w:outlineLvl w:val="9"/>
     </w:pPr>
+    <w:rPr>
+      <w:color w:val="000000"/>
+    </w:rPr>
   </w:style>
   <w:style w:type="table" w:styleId="TableGrid">
     <w:name w:val="Table Grid"/>

</xml_diff>

<commit_message>
SASTT-4 Sync Word reports with backend design amendment
Update both reports with the eight findings from PR #5, ten clarified acceptance criteria, recovery and version rules, the component diagram and Salesloft evidence. Preserve the 14-page main report, 15 scientific publications and black formatting; appendices are 26 pages with 49 APA 7 references.
</commit_message>
<xml_diff>
--- a/docs/research_and_design.docx
+++ b/docs/research_and_design.docx
@@ -37,7 +37,7 @@
         <w:rPr>
           <w:color w:val="000000"/>
         </w:rPr>
-        <w:t>Checkpoint 24 October 2026  |  Prepared 22 October 2026</w:t>
+        <w:t>Checkpoint 24 October 2026  |  Revised 23 October 2026</w:t>
       </w:r>
     </w:p>
     <w:p>
@@ -562,7 +562,7 @@
         <w:rPr>
           <w:color w:val="000000"/>
         </w:rPr>
-        <w:t>The expected outcome is a working research prototype with documented interfaces and reproducible evaluation. At this checkpoint, the completed work consists of desk research, public-data profiling and initial design and UX materials. Interviews, pilot recording access and supervisor feedback remain pending. A complete application is not required on 24 October.</w:t>
+        <w:t>The expected outcome is a working research prototype with documented interfaces and reproducible evaluation. The checkpoint materials include research, public-data profiling, a synthetic UX prototype and Bekzat’s backend design amendment. Local user evidence, recording access and supervisor feedback remain pending. A complete application is not required on 24 October.</w:t>
       </w:r>
     </w:p>
     <w:p>
@@ -571,6 +571,9 @@
         <w:pageBreakBefore/>
       </w:pPr>
       <w:r>
+        <w:rPr>
+          <w:color w:val="000000"/>
+        </w:rPr>
         <w:t>2 Evidence of relevance</w:t>
       </w:r>
     </w:p>
@@ -595,6 +598,9 @@
     </w:p>
     <w:p>
       <w:r>
+        <w:rPr>
+          <w:color w:val="000000"/>
+        </w:rPr>
         <w:t>We profiled the UCI Bank Marketing file bank-additional-full.csv. It contains 41,188 records, 20 input variables and 4,640 positive term-deposit subscription outcomes: 11.27% positive. Always predicting the negative class would give 88.73% accuracy. This simple calculation explains why a future outcome model should not be judged on accuracy alone (Moro et al., 2014).</w:t>
       </w:r>
     </w:p>
@@ -1152,7 +1158,7 @@
         <w:rPr>
           <w:color w:val="000000"/>
         </w:rPr>
-        <w:t>The brief requires 3–5 representative discussions or a substantive agreement with an actual client. Neither has been completed yet. We will record observations, self-reports and assumptions separately, then use confirmed findings to revise the requirements. Appendix F contains the collection forms.</w:t>
+        <w:t>Public-data analysis is complete; local discussions and a client agreement are not recorded. We will confirm with the supervisor whether this evidence route is sufficient, record any remaining gap, and map confirmed findings to requirements. Appendix F contains the collection forms.</w:t>
       </w:r>
     </w:p>
     <w:p>
@@ -1191,11 +1197,17 @@
         <w:pStyle w:val="Heading1"/>
       </w:pPr>
       <w:r>
+        <w:rPr>
+          <w:color w:val="000000"/>
+        </w:rPr>
         <w:t>3 Literature review</w:t>
       </w:r>
     </w:p>
     <w:p>
       <w:r>
+        <w:rPr>
+          <w:color w:val="000000"/>
+        </w:rPr>
         <w:t>The review covers 15 scientific publications, including 13 from 2022–2026 and two 2021 foundations. Good et al. (2026) and Vieira et al. (2024) were reviewed through abstracts/previews only. The table summarizes the design implications; Appendix A retains full analysis and claim locations. L01–L15 are analysis IDs, not citation numbers.</w:t>
       </w:r>
     </w:p>
@@ -1231,6 +1243,7 @@
               <w:rPr>
                 <w:rFonts w:ascii="Arial" w:hAnsi="Arial"/>
                 <w:b/>
+                <w:color w:val="000000"/>
                 <w:sz w:val="18"/>
               </w:rPr>
               <w:t>ID</w:t>
@@ -1253,6 +1266,7 @@
               <w:rPr>
                 <w:rFonts w:ascii="Arial" w:hAnsi="Arial"/>
                 <w:b/>
+                <w:color w:val="000000"/>
                 <w:sz w:val="18"/>
               </w:rPr>
               <w:t>Study</w:t>
@@ -1275,6 +1289,7 @@
               <w:rPr>
                 <w:rFonts w:ascii="Arial" w:hAnsi="Arial"/>
                 <w:b/>
+                <w:color w:val="000000"/>
                 <w:sz w:val="18"/>
               </w:rPr>
               <w:t>Finding and design implication</w:t>
@@ -1298,6 +1313,7 @@
             <w:r>
               <w:rPr>
                 <w:rFonts w:ascii="Arial" w:hAnsi="Arial"/>
+                <w:color w:val="000000"/>
                 <w:sz w:val="18"/>
               </w:rPr>
               <w:t>L01</w:t>
@@ -1319,6 +1335,7 @@
             <w:r>
               <w:rPr>
                 <w:rFonts w:ascii="Arial" w:hAnsi="Arial"/>
+                <w:color w:val="000000"/>
                 <w:sz w:val="18"/>
               </w:rPr>
               <w:t>Radford et al. (2023)</w:t>
@@ -1342,6 +1359,7 @@
             <w:r>
               <w:rPr>
                 <w:rFonts w:ascii="Arial" w:hAnsi="Arial"/>
+                <w:color w:val="000000"/>
                 <w:sz w:val="18"/>
               </w:rPr>
               <w:t>Broad multilingual transfer; local accuracy is unverified. Measure each language and business entity.</w:t>
@@ -1365,6 +1383,7 @@
             <w:r>
               <w:rPr>
                 <w:rFonts w:ascii="Arial" w:hAnsi="Arial"/>
+                <w:color w:val="000000"/>
                 <w:sz w:val="18"/>
               </w:rPr>
               <w:t>L02</w:t>
@@ -1386,6 +1405,7 @@
             <w:r>
               <w:rPr>
                 <w:rFonts w:ascii="Arial" w:hAnsi="Arial"/>
+                <w:color w:val="000000"/>
                 <w:sz w:val="18"/>
               </w:rPr>
               <w:t>Bain et al. (2023)</w:t>
@@ -1409,6 +1429,7 @@
             <w:r>
               <w:rPr>
                 <w:rFonts w:ascii="Arial" w:hAnsi="Arial"/>
+                <w:color w:val="000000"/>
                 <w:sz w:val="18"/>
               </w:rPr>
               <w:t>Timing/alignment depends on language models. Validate source timestamps on local calls.</w:t>
@@ -1432,6 +1453,7 @@
             <w:r>
               <w:rPr>
                 <w:rFonts w:ascii="Arial" w:hAnsi="Arial"/>
+                <w:color w:val="000000"/>
                 <w:sz w:val="18"/>
               </w:rPr>
               <w:t>L03</w:t>
@@ -1453,6 +1475,7 @@
             <w:r>
               <w:rPr>
                 <w:rFonts w:ascii="Arial" w:hAnsi="Arial"/>
+                <w:color w:val="000000"/>
                 <w:sz w:val="18"/>
               </w:rPr>
               <w:t>Bredin (2023)</w:t>
@@ -1476,6 +1499,7 @@
             <w:r>
               <w:rPr>
                 <w:rFonts w:ascii="Arial" w:hAnsi="Arial"/>
+                <w:color w:val="000000"/>
                 <w:sz w:val="18"/>
               </w:rPr>
               <w:t>Diarization varies with acoustic domain. Confirm salesperson/customer roles separately.</w:t>
@@ -1499,6 +1523,7 @@
             <w:r>
               <w:rPr>
                 <w:rFonts w:ascii="Arial" w:hAnsi="Arial"/>
+                <w:color w:val="000000"/>
                 <w:sz w:val="18"/>
               </w:rPr>
               <w:t>L04</w:t>
@@ -1520,6 +1545,7 @@
             <w:r>
               <w:rPr>
                 <w:rFonts w:ascii="Arial" w:hAnsi="Arial"/>
+                <w:color w:val="000000"/>
                 <w:sz w:val="18"/>
               </w:rPr>
               <w:t>Mussakhojayeva et al. (2022)</w:t>
@@ -1543,6 +1569,7 @@
             <w:r>
               <w:rPr>
                 <w:rFonts w:ascii="Arial" w:hAnsi="Arial"/>
+                <w:color w:val="000000"/>
                 <w:sz w:val="18"/>
               </w:rPr>
               <w:t>Spontaneous-subset WER is 27.0–36.8%. Use a separate local sales-speech evaluation.</w:t>
@@ -1566,6 +1593,7 @@
             <w:r>
               <w:rPr>
                 <w:rFonts w:ascii="Arial" w:hAnsi="Arial"/>
+                <w:color w:val="000000"/>
                 <w:sz w:val="18"/>
               </w:rPr>
               <w:t>L05</w:t>
@@ -1587,6 +1615,7 @@
             <w:r>
               <w:rPr>
                 <w:rFonts w:ascii="Arial" w:hAnsi="Arial"/>
+                <w:color w:val="000000"/>
                 <w:sz w:val="18"/>
               </w:rPr>
               <w:t>Asi et al. (2022)</w:t>
@@ -1610,6 +1639,7 @@
             <w:r>
               <w:rPr>
                 <w:rFonts w:ascii="Arial" w:hAnsi="Arial"/>
+                <w:color w:val="000000"/>
                 <w:sz w:val="18"/>
               </w:rPr>
               <w:t>Pseudo-only ROUGE gains conflict with automatic FactCC. Check source support and permit human correction.</w:t>
@@ -1633,6 +1663,7 @@
             <w:r>
               <w:rPr>
                 <w:rFonts w:ascii="Arial" w:hAnsi="Arial"/>
+                <w:color w:val="000000"/>
                 <w:sz w:val="18"/>
               </w:rPr>
               <w:t>L06</w:t>
@@ -1654,6 +1685,7 @@
             <w:r>
               <w:rPr>
                 <w:rFonts w:ascii="Arial" w:hAnsi="Arial"/>
+                <w:color w:val="000000"/>
                 <w:sz w:val="18"/>
               </w:rPr>
               <w:t>Zhong et al. (2021)</w:t>
@@ -1677,6 +1709,7 @@
             <w:r>
               <w:rPr>
                 <w:rFonts w:ascii="Arial" w:hAnsi="Arial"/>
+                <w:color w:val="000000"/>
                 <w:sz w:val="18"/>
               </w:rPr>
               <w:t>Retrieval helps query-based meeting summaries. Retrieve evidence before producing a highlight.</w:t>
@@ -1700,6 +1733,7 @@
             <w:r>
               <w:rPr>
                 <w:rFonts w:ascii="Arial" w:hAnsi="Arial"/>
+                <w:color w:val="000000"/>
                 <w:sz w:val="18"/>
               </w:rPr>
               <w:t>L07</w:t>
@@ -1721,6 +1755,7 @@
             <w:r>
               <w:rPr>
                 <w:rFonts w:ascii="Arial" w:hAnsi="Arial"/>
+                <w:color w:val="000000"/>
                 <w:sz w:val="18"/>
               </w:rPr>
               <w:t>Tang et al. (2022)</w:t>
@@ -1744,6 +1779,7 @@
             <w:r>
               <w:rPr>
                 <w:rFonts w:ascii="Arial" w:hAnsi="Arial"/>
+                <w:color w:val="000000"/>
                 <w:sz w:val="18"/>
               </w:rPr>
               <w:t>Faithfulness gains have small, uneven human evaluation. Audit entities, negation, reference and modality.</w:t>
@@ -1767,6 +1803,7 @@
             <w:r>
               <w:rPr>
                 <w:rFonts w:ascii="Arial" w:hAnsi="Arial"/>
+                <w:color w:val="000000"/>
                 <w:sz w:val="18"/>
               </w:rPr>
               <w:t>L08</w:t>
@@ -1788,6 +1825,7 @@
             <w:r>
               <w:rPr>
                 <w:rFonts w:ascii="Arial" w:hAnsi="Arial"/>
+                <w:color w:val="000000"/>
                 <w:sz w:val="18"/>
               </w:rPr>
               <w:t>Koenecke et al. (2024)</w:t>
@@ -1811,6 +1849,7 @@
             <w:r>
               <w:rPr>
                 <w:rFonts w:ascii="Arial" w:hAnsi="Arial"/>
+                <w:color w:val="000000"/>
                 <w:sz w:val="18"/>
               </w:rPr>
               <w:t>Historical ASR hallucinations show unsupported-text risk. Check original audio and silence controls.</w:t>
@@ -1834,6 +1873,7 @@
             <w:r>
               <w:rPr>
                 <w:rFonts w:ascii="Arial" w:hAnsi="Arial"/>
+                <w:color w:val="000000"/>
                 <w:sz w:val="18"/>
               </w:rPr>
               <w:t>L09</w:t>
@@ -1855,6 +1895,7 @@
             <w:r>
               <w:rPr>
                 <w:rFonts w:ascii="Arial" w:hAnsi="Arial"/>
+                <w:color w:val="000000"/>
                 <w:sz w:val="18"/>
               </w:rPr>
               <w:t>Mäntyvaara et al. (2026)</w:t>
@@ -1878,6 +1919,7 @@
             <w:r>
               <w:rPr>
                 <w:rFonts w:ascii="Arial" w:hAnsi="Arial"/>
+                <w:color w:val="000000"/>
                 <w:sz w:val="18"/>
               </w:rPr>
               <w:t>Engineered rejection target raises circularity concerns. Define independent outcomes and leakage controls.</w:t>
@@ -1901,6 +1943,7 @@
             <w:r>
               <w:rPr>
                 <w:rFonts w:ascii="Arial" w:hAnsi="Arial"/>
+                <w:color w:val="000000"/>
                 <w:sz w:val="18"/>
               </w:rPr>
               <w:t>L10</w:t>
@@ -1922,6 +1965,7 @@
             <w:r>
               <w:rPr>
                 <w:rFonts w:ascii="Arial" w:hAnsi="Arial"/>
+                <w:color w:val="000000"/>
                 <w:sz w:val="18"/>
               </w:rPr>
               <w:t>Stock et al. (2024)</w:t>
@@ -1945,6 +1989,7 @@
             <w:r>
               <w:rPr>
                 <w:rFonts w:ascii="Arial" w:hAnsi="Arial"/>
+                <w:color w:val="000000"/>
                 <w:sz w:val="18"/>
               </w:rPr>
               <w:t>German call annotations associate with customer ratings. Keep auditable dialogue-act labels and timestamps.</w:t>
@@ -1968,6 +2013,7 @@
             <w:r>
               <w:rPr>
                 <w:rFonts w:ascii="Arial" w:hAnsi="Arial"/>
+                <w:color w:val="000000"/>
                 <w:sz w:val="18"/>
               </w:rPr>
               <w:t>L11</w:t>
@@ -1989,6 +2035,7 @@
             <w:r>
               <w:rPr>
                 <w:rFonts w:ascii="Arial" w:hAnsi="Arial"/>
+                <w:color w:val="000000"/>
                 <w:sz w:val="18"/>
               </w:rPr>
               <w:t>Fu et al. (2022)</w:t>
@@ -2012,6 +2059,7 @@
             <w:r>
               <w:rPr>
                 <w:rFonts w:ascii="Arial" w:hAnsi="Arial"/>
+                <w:color w:val="000000"/>
                 <w:sz w:val="18"/>
               </w:rPr>
               <w:t>Entity sentiment differs from intent or sales success. Show opinion spans; validate local transfer.</w:t>
@@ -2035,6 +2083,7 @@
             <w:r>
               <w:rPr>
                 <w:rFonts w:ascii="Arial" w:hAnsi="Arial"/>
+                <w:color w:val="000000"/>
                 <w:sz w:val="18"/>
               </w:rPr>
               <w:t>L12</w:t>
@@ -2056,6 +2105,7 @@
             <w:r>
               <w:rPr>
                 <w:rFonts w:ascii="Arial" w:hAnsi="Arial"/>
+                <w:color w:val="000000"/>
                 <w:sz w:val="18"/>
               </w:rPr>
               <w:t>Good et al. (2026)</w:t>
@@ -2079,6 +2129,7 @@
             <w:r>
               <w:rPr>
                 <w:rFonts w:ascii="Arial" w:hAnsi="Arial"/>
+                <w:color w:val="000000"/>
                 <w:sz w:val="18"/>
               </w:rPr>
               <w:t>Written B2C lead signals link chats with outcomes. Test lead features; speech transfer is unverified.</w:t>
@@ -2102,6 +2153,7 @@
             <w:r>
               <w:rPr>
                 <w:rFonts w:ascii="Arial" w:hAnsi="Arial"/>
+                <w:color w:val="000000"/>
                 <w:sz w:val="18"/>
               </w:rPr>
               <w:t>L13</w:t>
@@ -2123,6 +2175,7 @@
             <w:r>
               <w:rPr>
                 <w:rFonts w:ascii="Arial" w:hAnsi="Arial"/>
+                <w:color w:val="000000"/>
                 <w:sz w:val="18"/>
               </w:rPr>
               <w:t>Vieira et al. (2024)</w:t>
@@ -2146,6 +2199,7 @@
             <w:r>
               <w:rPr>
                 <w:rFonts w:ascii="Arial" w:hAnsi="Arial"/>
+                <w:color w:val="000000"/>
                 <w:sz w:val="18"/>
               </w:rPr>
               <w:t>B2B chat associations are observational. Separate revenue, frequency and conversion.</w:t>
@@ -2169,6 +2223,7 @@
             <w:r>
               <w:rPr>
                 <w:rFonts w:ascii="Arial" w:hAnsi="Arial"/>
+                <w:color w:val="000000"/>
                 <w:sz w:val="18"/>
               </w:rPr>
               <w:t>L14</w:t>
@@ -2190,6 +2245,7 @@
             <w:r>
               <w:rPr>
                 <w:rFonts w:ascii="Arial" w:hAnsi="Arial"/>
+                <w:color w:val="000000"/>
                 <w:sz w:val="18"/>
               </w:rPr>
               <w:t>Humă and Stokoe (2023)</w:t>
@@ -2213,6 +2269,7 @@
             <w:r>
               <w:rPr>
                 <w:rFonts w:ascii="Arial" w:hAnsi="Arial"/>
+                <w:color w:val="000000"/>
                 <w:sz w:val="18"/>
               </w:rPr>
               <w:t>Resistance distinguishes ending from delaying a sale. Retain context and distinguish rejection/postponement.</w:t>
@@ -2236,6 +2293,7 @@
             <w:r>
               <w:rPr>
                 <w:rFonts w:ascii="Arial" w:hAnsi="Arial"/>
+                <w:color w:val="000000"/>
                 <w:sz w:val="18"/>
               </w:rPr>
               <w:t>L15</w:t>
@@ -2257,6 +2315,7 @@
             <w:r>
               <w:rPr>
                 <w:rFonts w:ascii="Arial" w:hAnsi="Arial"/>
+                <w:color w:val="000000"/>
                 <w:sz w:val="18"/>
               </w:rPr>
               <w:t>Song et al. (2021)</w:t>
@@ -2280,6 +2339,7 @@
             <w:r>
               <w:rPr>
                 <w:rFonts w:ascii="Arial" w:hAnsi="Arial"/>
+                <w:color w:val="000000"/>
                 <w:sz w:val="18"/>
               </w:rPr>
               <w:t>FinTech integration demo does not prove sales uplift. Use as architecture precedent, not performance proof.</w:t>
@@ -2303,11 +2363,17 @@
         <w:pStyle w:val="Heading1"/>
       </w:pPr>
       <w:r>
+        <w:rPr>
+          <w:color w:val="000000"/>
+        </w:rPr>
         <w:t>4 Existing system comparison</w:t>
       </w:r>
     </w:p>
     <w:p>
       <w:r>
+        <w:rPr>
+          <w:color w:val="000000"/>
+        </w:rPr>
         <w:t>Four systems were compared against the same eight criteria: capture, transcript review, CRM linkage, derived insights, coaching, aggregate analysis, languages and access. These are documented capabilities, not independent benchmarks. Appendix G contains the complete matrix, citations and feature caveats.</w:t>
       </w:r>
     </w:p>
@@ -2343,6 +2409,7 @@
               <w:rPr>
                 <w:rFonts w:ascii="Arial" w:hAnsi="Arial"/>
                 <w:b/>
+                <w:color w:val="000000"/>
                 <w:sz w:val="19"/>
               </w:rPr>
               <w:t>System</w:t>
@@ -2365,6 +2432,7 @@
               <w:rPr>
                 <w:rFonts w:ascii="Arial" w:hAnsi="Arial"/>
                 <w:b/>
+                <w:color w:val="000000"/>
                 <w:sz w:val="19"/>
               </w:rPr>
               <w:t>Documented capability summary</w:t>
@@ -2387,6 +2455,7 @@
               <w:rPr>
                 <w:rFonts w:ascii="Arial" w:hAnsi="Arial"/>
                 <w:b/>
+                <w:color w:val="000000"/>
                 <w:sz w:val="19"/>
               </w:rPr>
               <w:t>Limit relevant to this project</w:t>
@@ -2410,6 +2479,7 @@
             <w:r>
               <w:rPr>
                 <w:rFonts w:ascii="Arial" w:hAnsi="Arial"/>
+                <w:color w:val="000000"/>
                 <w:sz w:val="19"/>
               </w:rPr>
               <w:t>Gong</w:t>
@@ -2431,6 +2501,7 @@
             <w:r>
               <w:rPr>
                 <w:rFonts w:ascii="Arial" w:hAnsi="Arial"/>
+                <w:color w:val="000000"/>
                 <w:sz w:val="19"/>
               </w:rPr>
               <w:t>Call capture, transcript search, CRM links, topics and coaching.</w:t>
@@ -2452,6 +2523,7 @@
             <w:r>
               <w:rPr>
                 <w:rFonts w:ascii="Arial" w:hAnsi="Arial"/>
+                <w:color w:val="000000"/>
                 <w:sz w:val="19"/>
               </w:rPr>
               <w:t>Russian/Kazakh are listed; local accuracy and commercial access need checking.</w:t>
@@ -2475,6 +2547,7 @@
             <w:r>
               <w:rPr>
                 <w:rFonts w:ascii="Arial" w:hAnsi="Arial"/>
+                <w:color w:val="000000"/>
                 <w:sz w:val="19"/>
               </w:rPr>
               <w:t>Salesloft Conversation Intelligence</w:t>
@@ -2496,9 +2569,10 @@
             <w:r>
               <w:rPr>
                 <w:rFonts w:ascii="Arial" w:hAnsi="Arial"/>
+                <w:color w:val="000000"/>
                 <w:sz w:val="19"/>
               </w:rPr>
-              <w:t>Call review, summaries/actions, coaching and cross-call topics.</w:t>
+              <w:t>Call review, summaries/actions, coaching, topic filtering and announced cross-call trends.</w:t>
             </w:r>
           </w:p>
         </w:tc>
@@ -2517,9 +2591,10 @@
             <w:r>
               <w:rPr>
                 <w:rFonts w:ascii="Arial" w:hAnsi="Arial"/>
+                <w:color w:val="000000"/>
                 <w:sz w:val="19"/>
               </w:rPr>
-              <w:t>Legacy/new product language parity and package conditions remain unverified.</w:t>
+              <w:t>Dual Salesloft/Clari Copilot subscriptions, CI entitlement and Team Access; legacy/new language parity remains unverified.</w:t>
             </w:r>
           </w:p>
         </w:tc>
@@ -2540,6 +2615,7 @@
             <w:r>
               <w:rPr>
                 <w:rFonts w:ascii="Arial" w:hAnsi="Arial"/>
+                <w:color w:val="000000"/>
                 <w:sz w:val="19"/>
               </w:rPr>
               <w:t>HubSpot Conversation Intelligence</w:t>
@@ -2561,6 +2637,7 @@
             <w:r>
               <w:rPr>
                 <w:rFonts w:ascii="Arial" w:hAnsi="Arial"/>
+                <w:color w:val="000000"/>
                 <w:sz w:val="19"/>
               </w:rPr>
               <w:t>Associated CRM records, transcripts, comments and reporting.</w:t>
@@ -2582,6 +2659,7 @@
             <w:r>
               <w:rPr>
                 <w:rFonts w:ascii="Arial" w:hAnsi="Arial"/>
+                <w:color w:val="000000"/>
                 <w:sz w:val="19"/>
               </w:rPr>
               <w:t>Russian/Kazakh are listed; transcription and reporting depend on seats/tier.</w:t>
@@ -2605,6 +2683,7 @@
             <w:r>
               <w:rPr>
                 <w:rFonts w:ascii="Arial" w:hAnsi="Arial"/>
+                <w:color w:val="000000"/>
                 <w:sz w:val="19"/>
               </w:rPr>
               <w:t>Dynamics 365 Sales CI</w:t>
@@ -2626,6 +2705,7 @@
             <w:r>
               <w:rPr>
                 <w:rFonts w:ascii="Arial" w:hAnsi="Arial"/>
+                <w:color w:val="000000"/>
                 <w:sz w:val="19"/>
               </w:rPr>
               <w:t>Teams conversations, CRM summaries and manager dashboards.</w:t>
@@ -2647,6 +2727,7 @@
             <w:r>
               <w:rPr>
                 <w:rFonts w:ascii="Arial" w:hAnsi="Arial"/>
+                <w:color w:val="000000"/>
                 <w:sz w:val="19"/>
               </w:rPr>
               <w:t>Insights vary by language; Russian/Kazakh are absent from the reviewed CI matrix.</w:t>
@@ -2661,9 +2742,10 @@
       </w:pPr>
       <w:r>
         <w:rPr>
+          <w:color w:val="000000"/>
           <w:sz w:val="19"/>
         </w:rPr>
-        <w:t>Sources: (Gong, n.d., 2026a, 2026b, 2026c, 2026d, 2026e; HubSpot, 2026a, 2026b; Microsoft, 2025, 2026a, 2026b, 2026c, 2026d; Salesloft, n.d.-a, n.d.-b, 2026a, 2026b, 2026c, 2026d).</w:t>
+        <w:t>Sources: (Gong, n.d., 2026a, 2026b, 2026c, 2026d, 2026e; HubSpot, 2026a, 2026b; Microsoft, 2025, 2026a, 2026b, 2026c, 2026d; Salesloft, n.d.-a, n.d.-b, 2026a, 2026b, 2026c, 2026d, 2026e).</w:t>
       </w:r>
     </w:p>
     <w:p>
@@ -2671,6 +2753,9 @@
         <w:pStyle w:val="Heading1"/>
       </w:pPr>
       <w:r>
+        <w:rPr>
+          <w:color w:val="000000"/>
+        </w:rPr>
         <w:t>5 Technology comparison</w:t>
       </w:r>
     </w:p>
@@ -2706,6 +2791,7 @@
               <w:rPr>
                 <w:rFonts w:ascii="Arial" w:hAnsi="Arial"/>
                 <w:b/>
+                <w:color w:val="000000"/>
                 <w:sz w:val="19"/>
               </w:rPr>
               <w:t>Decision</w:t>
@@ -2728,6 +2814,7 @@
               <w:rPr>
                 <w:rFonts w:ascii="Arial" w:hAnsi="Arial"/>
                 <w:b/>
+                <w:color w:val="000000"/>
                 <w:sz w:val="19"/>
               </w:rPr>
               <w:t>Three alternatives</w:t>
@@ -2750,6 +2837,7 @@
               <w:rPr>
                 <w:rFonts w:ascii="Arial" w:hAnsi="Arial"/>
                 <w:b/>
+                <w:color w:val="000000"/>
                 <w:sz w:val="19"/>
               </w:rPr>
               <w:t>Proposed choice and reason</w:t>
@@ -2773,6 +2861,7 @@
             <w:r>
               <w:rPr>
                 <w:rFonts w:ascii="Arial" w:hAnsi="Arial"/>
+                <w:color w:val="000000"/>
                 <w:sz w:val="19"/>
               </w:rPr>
               <w:t>Backend</w:t>
@@ -2794,6 +2883,7 @@
             <w:r>
               <w:rPr>
                 <w:rFonts w:ascii="Arial" w:hAnsi="Arial"/>
+                <w:color w:val="000000"/>
                 <w:sz w:val="19"/>
               </w:rPr>
               <w:t>FastAPI; Django; NestJS</w:t>
@@ -2815,6 +2905,7 @@
             <w:r>
               <w:rPr>
                 <w:rFonts w:ascii="Arial" w:hAnsi="Arial"/>
+                <w:color w:val="000000"/>
                 <w:sz w:val="19"/>
               </w:rPr>
               <w:t>FastAPI keeps API and speech/evaluation tooling in Python.</w:t>
@@ -2838,6 +2929,7 @@
             <w:r>
               <w:rPr>
                 <w:rFonts w:ascii="Arial" w:hAnsi="Arial"/>
+                <w:color w:val="000000"/>
                 <w:sz w:val="19"/>
               </w:rPr>
               <w:t>Database</w:t>
@@ -2859,6 +2951,7 @@
             <w:r>
               <w:rPr>
                 <w:rFonts w:ascii="Arial" w:hAnsi="Arial"/>
+                <w:color w:val="000000"/>
                 <w:sz w:val="19"/>
               </w:rPr>
               <w:t>PostgreSQL; SQLite; MongoDB</w:t>
@@ -2880,6 +2973,7 @@
             <w:r>
               <w:rPr>
                 <w:rFonts w:ascii="Arial" w:hAnsi="Arial"/>
+                <w:color w:val="000000"/>
                 <w:sz w:val="19"/>
               </w:rPr>
               <w:t>PostgreSQL supports explicit shared deal/call relationships and JSON metadata.</w:t>
@@ -2903,6 +2997,7 @@
             <w:r>
               <w:rPr>
                 <w:rFonts w:ascii="Arial" w:hAnsi="Arial"/>
+                <w:color w:val="000000"/>
                 <w:sz w:val="19"/>
               </w:rPr>
               <w:t>Speech recognition</w:t>
@@ -2924,6 +3019,7 @@
             <w:r>
               <w:rPr>
                 <w:rFonts w:ascii="Arial" w:hAnsi="Arial"/>
+                <w:color w:val="000000"/>
                 <w:sz w:val="19"/>
               </w:rPr>
               <w:t>Local Whisper; Azure Speech; Google Cloud STT</w:t>
@@ -2945,6 +3041,7 @@
             <w:r>
               <w:rPr>
                 <w:rFonts w:ascii="Arial" w:hAnsi="Arial"/>
+                <w:color w:val="000000"/>
                 <w:sz w:val="19"/>
               </w:rPr>
               <w:t>Local Whisper baseline; compare quality and compute before choosing model size.</w:t>
@@ -2968,6 +3065,7 @@
             <w:r>
               <w:rPr>
                 <w:rFonts w:ascii="Arial" w:hAnsi="Arial"/>
+                <w:color w:val="000000"/>
                 <w:sz w:val="19"/>
               </w:rPr>
               <w:t>Job processing</w:t>
@@ -2989,6 +3087,7 @@
             <w:r>
               <w:rPr>
                 <w:rFonts w:ascii="Arial" w:hAnsi="Arial"/>
+                <w:color w:val="000000"/>
                 <w:sz w:val="19"/>
               </w:rPr>
               <w:t>Synchronous requests; FastAPI BackgroundTasks; Celery</w:t>
@@ -3010,9 +3109,10 @@
             <w:r>
               <w:rPr>
                 <w:rFonts w:ascii="Arial" w:hAnsi="Arial"/>
+                <w:color w:val="000000"/>
                 <w:sz w:val="19"/>
               </w:rPr>
-              <w:t>Celery with Redis separates inference and recovery from dashboard requests.</w:t>
+              <w:t>Celery/Redis with PostgreSQL job and outbox recovery keeps processing separate from the API.</w:t>
             </w:r>
           </w:p>
         </w:tc>
@@ -3021,6 +3121,7 @@
     <w:p>
       <w:r>
         <w:rPr>
+          <w:color w:val="000000"/>
           <w:sz w:val="19"/>
         </w:rPr>
         <w:t>Technical sources: (Celery, n.d.; Django Software Foundation, n.d.; FastAPI, n.d.-a, n.d.-b; Google Cloud, 2026a, 2026b; Microsoft, 2026e; MongoDB, n.d.; NestJS, n.d.; OpenAI, n.d.; PostgreSQL Global Development Group, n.d.-a, n.d.-b; SQLite, n.d.). Appendix G preserves the full alternatives and evidence. Private local/S3-compatible audio storage, explicit permissions and reproducible benchmarks remain design requirements; no accuracy or cost winner is assumed.</w:t>
@@ -3041,12 +3142,18 @@
         <w:pStyle w:val="Heading1"/>
       </w:pPr>
       <w:r>
+        <w:rPr>
+          <w:color w:val="000000"/>
+        </w:rPr>
         <w:t>6 Requirements specification</w:t>
       </w:r>
     </w:p>
     <w:p>
       <w:r>
-        <w:t>All 26 requirements and acceptance tests are retained in Appendix B and docs/requirements.csv. Must items define the MVP; Should items may be revised after the pilot and Could items are optional. The grouped summary below preserves scope while avoiding repeated acceptance detail.</w:t>
+        <w:rPr>
+          <w:color w:val="000000"/>
+        </w:rPr>
+        <w:t>All 26 requirements, priorities and test mappings are retained in Appendix B and docs/requirements.csv. Bekzat’s review clarified team ownership, atomic imports, durable jobs, version conflicts, access, reporting and deletion. Must items define the MVP; Should items are provisional and Could items are optional. These are specifications for implementation, not passed backend tests.</w:t>
       </w:r>
     </w:p>
     <w:tbl>
@@ -3081,6 +3188,7 @@
               <w:rPr>
                 <w:rFonts w:ascii="Arial" w:hAnsi="Arial"/>
                 <w:b/>
+                <w:color w:val="000000"/>
                 <w:sz w:val="19"/>
               </w:rPr>
               <w:t>Requirement IDs</w:t>
@@ -3103,6 +3211,7 @@
               <w:rPr>
                 <w:rFonts w:ascii="Arial" w:hAnsi="Arial"/>
                 <w:b/>
+                <w:color w:val="000000"/>
                 <w:sz w:val="19"/>
               </w:rPr>
               <w:t>Scope and priority</w:t>
@@ -3125,6 +3234,7 @@
               <w:rPr>
                 <w:rFonts w:ascii="Arial" w:hAnsi="Arial"/>
                 <w:b/>
+                <w:color w:val="000000"/>
                 <w:sz w:val="19"/>
               </w:rPr>
               <w:t>Acceptance evidence</w:t>
@@ -3148,6 +3258,7 @@
             <w:r>
               <w:rPr>
                 <w:rFonts w:ascii="Arial" w:hAnsi="Arial"/>
+                <w:color w:val="000000"/>
                 <w:sz w:val="19"/>
               </w:rPr>
               <w:t>FR01</w:t>
@@ -3169,6 +3280,7 @@
             <w:r>
               <w:rPr>
                 <w:rFonts w:ascii="Arial" w:hAnsi="Arial"/>
+                <w:color w:val="000000"/>
                 <w:sz w:val="19"/>
               </w:rPr>
               <w:t>Must: authentication and scoped access</w:t>
@@ -3190,9 +3302,10 @@
             <w:r>
               <w:rPr>
                 <w:rFonts w:ascii="Arial" w:hAnsi="Arial"/>
+                <w:color w:val="000000"/>
                 <w:sz w:val="19"/>
               </w:rPr>
-              <w:t>401 without login; deny cross-team and direct-ID access.</w:t>
+              <w:t>401 without login; 404 for invisible objects; 403 for forbidden actions; grants remain team scoped.</w:t>
             </w:r>
           </w:p>
         </w:tc>
@@ -3213,6 +3326,7 @@
             <w:r>
               <w:rPr>
                 <w:rFonts w:ascii="Arial" w:hAnsi="Arial"/>
+                <w:color w:val="000000"/>
                 <w:sz w:val="19"/>
               </w:rPr>
               <w:t>FR02–FR03</w:t>
@@ -3234,6 +3348,7 @@
             <w:r>
               <w:rPr>
                 <w:rFonts w:ascii="Arial" w:hAnsi="Arial"/>
+                <w:color w:val="000000"/>
                 <w:sz w:val="19"/>
               </w:rPr>
               <w:t>Must: CSV import and explicit call/deal joins</w:t>
@@ -3255,9 +3370,10 @@
             <w:r>
               <w:rPr>
                 <w:rFonts w:ascii="Arial" w:hAnsi="Arial"/>
+                <w:color w:val="000000"/>
                 <w:sz w:val="19"/>
               </w:rPr>
-              <w:t>Report invalid rows and missing links; repeated imports do not duplicate records.</w:t>
+              <w:t>Apply valid batches atomically with team/source keys; reject invalid links and stale updates without partial writes.</w:t>
             </w:r>
           </w:p>
         </w:tc>
@@ -3278,6 +3394,7 @@
             <w:r>
               <w:rPr>
                 <w:rFonts w:ascii="Arial" w:hAnsi="Arial"/>
+                <w:color w:val="000000"/>
                 <w:sz w:val="19"/>
               </w:rPr>
               <w:t>FR04–FR05</w:t>
@@ -3299,6 +3416,7 @@
             <w:r>
               <w:rPr>
                 <w:rFonts w:ascii="Arial" w:hAnsi="Arial"/>
+                <w:color w:val="000000"/>
                 <w:sz w:val="19"/>
               </w:rPr>
               <w:t>Must: permitted audio and recoverable jobs</w:t>
@@ -3320,9 +3438,10 @@
             <w:r>
               <w:rPr>
                 <w:rFonts w:ascii="Arial" w:hAnsi="Arial"/>
+                <w:color w:val="000000"/>
                 <w:sz w:val="19"/>
               </w:rPr>
-              <w:t>Validate size/duration; expose job ID, states, bounded retries and failures.</w:t>
+              <w:t>Validate media; recover committed jobs; one initial attempt plus at most two automatic retries, including crashes.</w:t>
             </w:r>
           </w:p>
         </w:tc>
@@ -3343,6 +3462,7 @@
             <w:r>
               <w:rPr>
                 <w:rFonts w:ascii="Arial" w:hAnsi="Arial"/>
+                <w:color w:val="000000"/>
                 <w:sz w:val="19"/>
               </w:rPr>
               <w:t>FR06–FR07</w:t>
@@ -3364,6 +3484,7 @@
             <w:r>
               <w:rPr>
                 <w:rFonts w:ascii="Arial" w:hAnsi="Arial"/>
+                <w:color w:val="000000"/>
                 <w:sz w:val="19"/>
               </w:rPr>
               <w:t>Must: versioned timestamps; Should: diarization</w:t>
@@ -3385,9 +3506,10 @@
             <w:r>
               <w:rPr>
                 <w:rFonts w:ascii="Arial" w:hAnsi="Arial"/>
+                <w:color w:val="000000"/>
                 <w:sz w:val="19"/>
               </w:rPr>
-              <w:t>Valid segment times and model metadata; confirm speaker roles separately.</w:t>
+              <w:t>Immutable transcript versions and provenance; valid times; confirm speaker roles separately.</w:t>
             </w:r>
           </w:p>
         </w:tc>
@@ -3408,6 +3530,7 @@
             <w:r>
               <w:rPr>
                 <w:rFonts w:ascii="Arial" w:hAnsi="Arial"/>
+                <w:color w:val="000000"/>
                 <w:sz w:val="19"/>
               </w:rPr>
               <w:t>FR08–FR09</w:t>
@@ -3429,6 +3552,7 @@
             <w:r>
               <w:rPr>
                 <w:rFonts w:ascii="Arial" w:hAnsi="Arial"/>
+                <w:color w:val="000000"/>
                 <w:sz w:val="19"/>
               </w:rPr>
               <w:t>Must: supported extraction and human review</w:t>
@@ -3450,9 +3574,10 @@
             <w:r>
               <w:rPr>
                 <w:rFonts w:ascii="Arial" w:hAnsi="Arial"/>
+                <w:color w:val="000000"/>
                 <w:sz w:val="19"/>
               </w:rPr>
-              <w:t>Valid evidence links, uncertainty, actor/time and old/new revision values.</w:t>
+              <w:t>Same-call/version evidence; separate item states; reject stale writes and invalidate changed evidence approvals.</w:t>
             </w:r>
           </w:p>
         </w:tc>
@@ -3473,6 +3598,7 @@
             <w:r>
               <w:rPr>
                 <w:rFonts w:ascii="Arial" w:hAnsi="Arial"/>
+                <w:color w:val="000000"/>
                 <w:sz w:val="19"/>
               </w:rPr>
               <w:t>FR10</w:t>
@@ -3494,6 +3620,7 @@
             <w:r>
               <w:rPr>
                 <w:rFonts w:ascii="Arial" w:hAnsi="Arial"/>
+                <w:color w:val="000000"/>
                 <w:sz w:val="19"/>
               </w:rPr>
               <w:t>Must: trustworthy dashboard</w:t>
@@ -3515,9 +3642,10 @@
             <w:r>
               <w:rPr>
                 <w:rFonts w:ascii="Arial" w:hAnsi="Arial"/>
+                <w:color w:val="000000"/>
                 <w:sz w:val="19"/>
               </w:rPr>
-              <w:t>Hand-calculated fixture totals; distinct deals and declared date basis.</w:t>
+              <w:t>Distinct deals, no-call deals, language cohorts, separate date bases/currencies and missing-amount counts.</w:t>
             </w:r>
           </w:p>
         </w:tc>
@@ -3538,6 +3666,7 @@
             <w:r>
               <w:rPr>
                 <w:rFonts w:ascii="Arial" w:hAnsi="Arial"/>
+                <w:color w:val="000000"/>
                 <w:sz w:val="19"/>
               </w:rPr>
               <w:t>FR11–FR12</w:t>
@@ -3559,6 +3688,7 @@
             <w:r>
               <w:rPr>
                 <w:rFonts w:ascii="Arial" w:hAnsi="Arial"/>
+                <w:color w:val="000000"/>
                 <w:sz w:val="19"/>
               </w:rPr>
               <w:t>Must: scoped search and CSV export</w:t>
@@ -3580,9 +3710,10 @@
             <w:r>
               <w:rPr>
                 <w:rFonts w:ascii="Arial" w:hAnsi="Arial"/>
+                <w:color w:val="000000"/>
                 <w:sz w:val="19"/>
               </w:rPr>
-              <w:t>Only permitted matches; export follows filters and neutralizes formula text.</w:t>
+              <w:t>Scoped matches; export the same authorized snapshot; recheck download grants and neutralize formulas.</w:t>
             </w:r>
           </w:p>
         </w:tc>
@@ -3603,6 +3734,7 @@
             <w:r>
               <w:rPr>
                 <w:rFonts w:ascii="Arial" w:hAnsi="Arial"/>
+                <w:color w:val="000000"/>
                 <w:sz w:val="19"/>
               </w:rPr>
               <w:t>FR13–FR14</w:t>
@@ -3624,6 +3756,7 @@
             <w:r>
               <w:rPr>
                 <w:rFonts w:ascii="Arial" w:hAnsi="Arial"/>
+                <w:color w:val="000000"/>
                 <w:sz w:val="19"/>
               </w:rPr>
               <w:t>Must: deletion and authoritative outcomes</w:t>
@@ -3645,9 +3778,10 @@
             <w:r>
               <w:rPr>
                 <w:rFonts w:ascii="Arial" w:hAnsi="Arial"/>
+                <w:color w:val="000000"/>
                 <w:sz w:val="19"/>
               </w:rPr>
-              <w:t>Delete active sensitive derivatives within 24h; backup expiry ≤30 days; CRM outcome remains authoritative.</w:t>
+              <w:t>Deny reads immediately; fence late writes; clean active content within 24h and expire backups within 30 days; retain CRM authority.</w:t>
             </w:r>
           </w:p>
         </w:tc>
@@ -3668,6 +3802,7 @@
             <w:r>
               <w:rPr>
                 <w:rFonts w:ascii="Arial" w:hAnsi="Arial"/>
+                <w:color w:val="000000"/>
                 <w:sz w:val="19"/>
               </w:rPr>
               <w:t>FR15–FR16</w:t>
@@ -3689,6 +3824,7 @@
             <w:r>
               <w:rPr>
                 <w:rFonts w:ascii="Arial" w:hAnsi="Arial"/>
+                <w:color w:val="000000"/>
                 <w:sz w:val="19"/>
               </w:rPr>
               <w:t>Should: evaluator; Could: future CRM adapter</w:t>
@@ -3710,6 +3846,7 @@
             <w:r>
               <w:rPr>
                 <w:rFonts w:ascii="Arial" w:hAnsi="Arial"/>
+                <w:color w:val="000000"/>
                 <w:sz w:val="19"/>
               </w:rPr>
               <w:t>Reproducible language/split/model results; optional scoped idempotent CRM sync.</w:t>
@@ -3723,6 +3860,9 @@
         <w:pStyle w:val="Heading2"/>
       </w:pPr>
       <w:r>
+        <w:rPr>
+          <w:color w:val="000000"/>
+        </w:rPr>
         <w:t>Quality and data rules</w:t>
       </w:r>
     </w:p>
@@ -3757,6 +3897,7 @@
               <w:rPr>
                 <w:rFonts w:ascii="Arial" w:hAnsi="Arial"/>
                 <w:b/>
+                <w:color w:val="000000"/>
                 <w:sz w:val="19"/>
               </w:rPr>
               <w:t>Requirement IDs</w:t>
@@ -3779,6 +3920,7 @@
               <w:rPr>
                 <w:rFonts w:ascii="Arial" w:hAnsi="Arial"/>
                 <w:b/>
+                <w:color w:val="000000"/>
                 <w:sz w:val="19"/>
               </w:rPr>
               <w:t>Quality and planned verification</w:t>
@@ -3802,6 +3944,7 @@
             <w:r>
               <w:rPr>
                 <w:rFonts w:ascii="Arial" w:hAnsi="Arial"/>
+                <w:color w:val="000000"/>
                 <w:sz w:val="19"/>
               </w:rPr>
               <w:t>NFR01–NFR03</w:t>
@@ -3823,6 +3966,7 @@
             <w:r>
               <w:rPr>
                 <w:rFonts w:ascii="Arial" w:hAnsi="Arial"/>
+                <w:color w:val="000000"/>
                 <w:sz w:val="19"/>
               </w:rPr>
               <w:t>Must: authorized/minimized data, private objects and secrets, version/hash/revision provenance.</w:t>
@@ -3846,6 +3990,7 @@
             <w:r>
               <w:rPr>
                 <w:rFonts w:ascii="Arial" w:hAnsi="Arial"/>
+                <w:color w:val="000000"/>
                 <w:sz w:val="19"/>
               </w:rPr>
               <w:t>NFR04–NFR05</w:t>
@@ -3867,6 +4012,7 @@
             <w:r>
               <w:rPr>
                 <w:rFonts w:ascii="Arial" w:hAnsi="Arial"/>
+                <w:color w:val="000000"/>
                 <w:sz w:val="19"/>
               </w:rPr>
               <w:t>Should: API p95 ≤2s under the declared fixture/load; ASR median real-time factor ≤1 and p95 ≤2 on the recorded host.</w:t>
@@ -3890,6 +4036,7 @@
             <w:r>
               <w:rPr>
                 <w:rFonts w:ascii="Arial" w:hAnsi="Arial"/>
+                <w:color w:val="000000"/>
                 <w:sz w:val="19"/>
               </w:rPr>
               <w:t>NFR06–NFR08</w:t>
@@ -3911,9 +4058,10 @@
             <w:r>
               <w:rPr>
                 <w:rFonts w:ascii="Arial" w:hAnsi="Arial"/>
+                <w:color w:val="000000"/>
                 <w:sz w:val="19"/>
               </w:rPr>
-              <w:t>Must: consistent recovery, usable keyboard workflow and teammate-reproducible setup. Future target: 4/5 users complete fixed tasks in 10 minutes without help.</w:t>
+              <w:t>Must: durable recovery, protected reviewed versions, keyboard workflow and reproducible setup. Future usability target: 4/5 users complete three fixed tasks in 10 minutes without help.</w:t>
             </w:r>
           </w:p>
         </w:tc>
@@ -3934,6 +4082,7 @@
             <w:r>
               <w:rPr>
                 <w:rFonts w:ascii="Arial" w:hAnsi="Arial"/>
+                <w:color w:val="000000"/>
                 <w:sz w:val="19"/>
               </w:rPr>
               <w:t>NFR09–NFR10</w:t>
@@ -3955,6 +4104,7 @@
             <w:r>
               <w:rPr>
                 <w:rFonts w:ascii="Arial" w:hAnsi="Arial"/>
+                <w:color w:val="000000"/>
                 <w:sz w:val="19"/>
               </w:rPr>
               <w:t>Should: provisional Russian WER ≤25% and Kazakh ≤30%. Must: raw source-grounded evidence precision ≥95%; zero fabricated numeric commitments after human review.</w:t>
@@ -3965,12 +4115,18 @@
     </w:tbl>
     <w:p>
       <w:r>
-        <w:t>Time targets exclude upload or ASR waiting where specified; Appendix B defines fixtures and conditions. Source-scoped external IDs map to immutable internal IDs. Calls link to existing deals; time is stored in UTC and initially displayed in Asia/Almaty. Keep currencies separate.</w:t>
+        <w:rPr>
+          <w:color w:val="000000"/>
+        </w:rPr>
+        <w:t>Time targets exclude upload or ASR waiting where specified. The server derives team ownership and assigns immutable internal IDs. Import keys include team and source; each call links to one authorized deal. Invalid rows block the whole import, and stale updates require revalidation. Times use UTC storage and a selected IANA timezone; money remains separate by currency, with missing-amount coverage reported.</w:t>
       </w:r>
     </w:p>
     <w:p>
       <w:r>
-        <w:t>Win rate = won / (won + lost), using distinct CRM deals closed in the selected period; no closed deals means Not available. Calls use recorded_at and open pipeline is a current snapshot. Salespeople see own records, managers their team and analysts only authorized data; administrator status grants no automatic call-content access.</w:t>
+        <w:rPr>
+          <w:color w:val="000000"/>
+        </w:rPr>
+        <w:t>Win rate = won / (won + lost), using distinct CRM deals closed in the reporting period; an empty denominator is Not available. All-language totals include deals without calls. Language filters select linked deals without multiplying them. Call volume uses recorded_at; open pipeline is a current snapshot. Salespeople, managers and analysts receive only their granted record scopes; administrators have no inherent content access.</w:t>
       </w:r>
     </w:p>
     <w:p>
@@ -3988,6 +4144,9 @@
         <w:pStyle w:val="Heading1"/>
       </w:pPr>
       <w:r>
+        <w:rPr>
+          <w:color w:val="000000"/>
+        </w:rPr>
         <w:t>7 Architecture and diagrams</w:t>
       </w:r>
     </w:p>
@@ -4067,6 +4226,9 @@
     </w:p>
     <w:p>
       <w:r>
+        <w:rPr>
+          <w:color w:val="000000"/>
+        </w:rPr>
         <w:br w:type="column"/>
       </w:r>
     </w:p>
@@ -4183,8 +4345,8 @@
         </w:rPr>
         <w:drawing>
           <wp:inline xmlns:a="http://schemas.openxmlformats.org/drawingml/2006/main" xmlns:pic="http://schemas.openxmlformats.org/drawingml/2006/picture">
-            <wp:extent cx="4800600" cy="3552444"/>
-            <wp:docPr id="3" name="Picture 3"/>
+            <wp:extent cx="6080760" cy="3561588"/>
+            <wp:docPr id="3" name="Picture 3" descr="Proposed API, PostgreSQL jobs and outbox, recovery dispatcher, Redis notifications, leased speech workers, private audio, evaluation and deletion responsibilities."/>
             <wp:cNvGraphicFramePr>
               <a:graphicFrameLocks noChangeAspect="1"/>
             </wp:cNvGraphicFramePr>
@@ -4206,7 +4368,7 @@
                   <pic:spPr>
                     <a:xfrm>
                       <a:off x="0" y="0"/>
-                      <a:ext cx="4800600" cy="3552444"/>
+                      <a:ext cx="6080760" cy="3561588"/>
                     </a:xfrm>
                     <a:prstGeom prst="rect"/>
                   </pic:spPr>
@@ -4225,7 +4387,7 @@
         <w:rPr>
           <w:color w:val="000000"/>
         </w:rPr>
-        <w:t>Figure 3 API storage and asynchronous worker responsibilities</w:t>
+        <w:t>Figure 3 Proposed components and durable job recovery</w:t>
       </w:r>
     </w:p>
     <w:p>
@@ -4233,7 +4395,7 @@
         <w:rPr>
           <w:color w:val="000000"/>
         </w:rPr>
-        <w:t>FastAPI validates imports and access, stores metadata and queues a job. A Celery worker reads private audio, runs transcription and extraction, and stores versioned results in PostgreSQL. Inference is separate from dashboard requests. Retention jobs remove active data and sensitive revisions under the agreed policy.</w:t>
+        <w:t>FastAPI validates access and imports, then commits a processing job and outbox record together in PostgreSQL. A dispatcher publishes job IDs to Redis; recovery scans handle missed messages and expired worker leases. Celery workers process private audio and commit complete versioned results. A late result cannot replace a human correction or restore deleting content. Audio uses an authenticated API proxy. Database, worker and cleanup responsibilities are proposed in Figure 3; the backend is not yet implemented.</w:t>
       </w:r>
     </w:p>
     <w:p>
@@ -4249,11 +4411,17 @@
     </w:p>
     <w:p>
       <w:r>
+        <w:rPr>
+          <w:color w:val="000000"/>
+        </w:rPr>
         <w:t>Open prototype/index.html for the local clickable mockup with synthetic records and manually written transcripts. It illustrates interaction; no speech service runs. Editable diagrams and SVG exports are in diagrams/. Appendix C retains role/data rules and Appendix F the larger UX preview.</w:t>
       </w:r>
     </w:p>
     <w:p>
       <w:r>
+        <w:rPr>
+          <w:color w:val="000000"/>
+        </w:rPr>
         <w:t>Flow: map and validate IDs → open a call → follow evidence → correct an objection → filter the dashboard. Eight calls link to seven CRM deals; repeated calls never multiply a deal. Retry and review are in-memory illustrations.</w:t>
       </w:r>
     </w:p>
@@ -4283,7 +4451,7 @@
         <w:rPr>
           <w:color w:val="000000"/>
         </w:rPr>
-        <w:t>The evaluation will separate transcription errors, extraction errors and workflow usability. The public-data profile and synthetic interface checks are complete; no model benchmark or representative-user study has been run. Appendix D gives the full protocol; Appendix B contains the T01–T22 test catalogue.</w:t>
+        <w:t>The evaluation separates transcription, extraction and workflow errors. Public-data profiling and synthetic interface checks are complete. Appendix D also specifies backend conflict, recovery, authorization and deletion scenarios; these have not run against an implemented backend. No model benchmark or representative-user study has been completed.</w:t>
       </w:r>
     </w:p>
     <w:p>
@@ -5741,7 +5909,7 @@
         <w:rPr>
           <w:color w:val="000000"/>
         </w:rPr>
-        <w:t>Status on 23 October 2026  PRs 2–4 are merged into main at https://github.com/ddigreen/sales-analytics-stt. Demo: https://ddigreen.github.io/vocasales-demo/. PRs 3–4 have recorded technical approvals. YouTrack at https://sales-analytics-stt-team.youtrack.cloud/projects/SASTT has 12 assigned Open issues. Source, public-data and prototype checks are recorded; independent student review, stakeholder evidence, supervisor feedback, reviewer access and the reviewed submission tag remain pending.</w:t>
+        <w:t>Status on 23 October 2026  PRs 2–6 are merged into main at https://github.com/ddigreen/sales-analytics-stt. Demo: https://ddigreen.github.io/vocasales-demo/. Bekzat’s PR 5 adds eight design findings and updated contracts; Diasbek reviewed it. Dameli’s substantive review remains pending for SASTT-4 acceptance. YouTrack has 12 assigned Open issues. Research, public-data and prototype checks are recorded; remaining work includes team acceptance, stakeholder evidence, supervisor feedback, reviewer access and a fixed submission tag.</w:t>
       </w:r>
     </w:p>
     <w:p>
@@ -5781,11 +5949,14 @@
         <w:rPr>
           <w:color w:val="000000"/>
         </w:rPr>
-        <w:t>After the meeting, record the actual date, artifact version, comment, decision, owner and resulting revision. Appendix F contains the feedback form. The remaining checkpoint evidence is stakeholder/client confirmation, approved recording access, supervisor feedback and revisions, and the actual tracking and contribution record. Application implementation continues after this checkpoint.</w:t>
+        <w:t>After the meeting, record the actual date, artifact version, comment, decision, owner and resulting revision. Appendix F contains the feedback form. Confirm the relevance-evidence route and recording permissions before collecting real audio. Supervisor feedback, team acceptance, reviewer access and the fixed submission tag remain pending. Application implementation continues after this checkpoint.</w:t>
       </w:r>
     </w:p>
     <w:p>
       <w:r>
+        <w:rPr>
+          <w:color w:val="000000"/>
+        </w:rPr>
         <w:t>Appendix guide: A detailed source analysis; B full requirements/tests; C data/access rules; D evaluation; E tasks/risks; F forms/UX; G full comparison matrices and evidence. Both documents use the same APA 7 author–date references.</w:t>
       </w:r>
     </w:p>
@@ -5796,6 +5967,9 @@
         <w:jc w:val="center"/>
       </w:pPr>
       <w:r>
+        <w:rPr>
+          <w:color w:val="000000"/>
+        </w:rPr>
         <w:t>References</w:t>
       </w:r>
     </w:p>
@@ -7957,49 +8131,27 @@
       </w:pPr>
       <w:r>
         <w:rPr>
-          <w:rFonts w:ascii="Arial" w:hAnsi="Arial"/>
-          <w:i w:val="0"/>
           <w:color w:val="000000"/>
-          <w:sz w:val="22"/>
-          <w:sz w:val="22"/>
         </w:rPr>
         <w:t xml:space="preserve">Salesloft. (n.d.-a). </w:t>
       </w:r>
       <w:r>
         <w:rPr>
-          <w:rFonts w:ascii="Arial" w:hAnsi="Arial"/>
           <w:i/>
           <w:color w:val="000000"/>
-          <w:sz w:val="22"/>
-          <w:sz w:val="22"/>
         </w:rPr>
         <w:t>AI-powered conversational intelligence</w:t>
       </w:r>
       <w:r>
         <w:rPr>
-          <w:rFonts w:ascii="Arial" w:hAnsi="Arial"/>
-          <w:i w:val="0"/>
           <w:color w:val="000000"/>
-          <w:sz w:val="22"/>
-          <w:sz w:val="22"/>
         </w:rPr>
-        <w:t xml:space="preserve">. </w:t>
-      </w:r>
-      <w:r>
-        <w:rPr>
-          <w:rFonts w:ascii="Arial" w:hAnsi="Arial"/>
-          <w:i w:val="0"/>
-          <w:color w:val="000000"/>
-          <w:sz w:val="22"/>
-          <w:sz w:val="22"/>
-        </w:rPr>
-        <w:t xml:space="preserve">Retrieved October 23, 2026, from </w:t>
+        <w:t xml:space="preserve">. Retrieved October 23, 2026, from </w:t>
       </w:r>
       <w:hyperlink r:id="rId69">
         <w:r>
           <w:rPr>
             <w:color w:val="000000"/>
-            <w:sz w:val="22"/>
           </w:rPr>
           <w:t>https://www.salesloft.com/lp/conversational-intelligence</w:t>
         </w:r>
@@ -8015,49 +8167,171 @@
       </w:pPr>
       <w:r>
         <w:rPr>
-          <w:rFonts w:ascii="Arial" w:hAnsi="Arial"/>
-          <w:i w:val="0"/>
           <w:color w:val="000000"/>
-          <w:sz w:val="22"/>
-          <w:sz w:val="22"/>
         </w:rPr>
         <w:t xml:space="preserve">Salesloft. (n.d.-b). </w:t>
       </w:r>
       <w:r>
         <w:rPr>
-          <w:rFonts w:ascii="Arial" w:hAnsi="Arial"/>
           <w:i/>
           <w:color w:val="000000"/>
-          <w:sz w:val="22"/>
-          <w:sz w:val="22"/>
+        </w:rPr>
+        <w:t>Conversation intelligence in Salesloft</w:t>
+      </w:r>
+      <w:r>
+        <w:rPr>
+          <w:color w:val="000000"/>
+        </w:rPr>
+        <w:t xml:space="preserve">. Retrieved October 23, 2026, from </w:t>
+      </w:r>
+      <w:hyperlink r:id="rId72">
+        <w:r>
+          <w:rPr>
+            <w:color w:val="000000"/>
+          </w:rPr>
+          <w:t>https://help.salesloft.com/s/article/Conversation-Intelligence-in-Salesloft?language=en_US</w:t>
+        </w:r>
+      </w:hyperlink>
+    </w:p>
+    <w:p>
+      <w:pPr>
+        <w:keepNext w:val="0"/>
+        <w:keepLines/>
+        <w:pageBreakBefore w:val="0"/>
+        <w:spacing w:line="480" w:lineRule="auto" w:before="0" w:after="0"/>
+        <w:ind w:left="720" w:hanging="720"/>
+      </w:pPr>
+      <w:r>
+        <w:rPr>
+          <w:color w:val="000000"/>
+        </w:rPr>
+        <w:t xml:space="preserve">Salesloft. (2026a, July 14). </w:t>
+      </w:r>
+      <w:r>
+        <w:rPr>
+          <w:i/>
+          <w:color w:val="000000"/>
+        </w:rPr>
+        <w:t>Clari + Salesloft defines the next era of AI conversation intelligence, turning buyer signals into revenue actions</w:t>
+      </w:r>
+      <w:r>
+        <w:rPr>
+          <w:color w:val="000000"/>
+        </w:rPr>
+        <w:t xml:space="preserve"> [Press release]. </w:t>
+      </w:r>
+      <w:hyperlink r:id="rId12">
+        <w:r>
+          <w:rPr>
+            <w:color w:val="000000"/>
+          </w:rPr>
+          <w:t>https://www.salesloft.com/company/newsroom/salesloft-conversation-intelligence</w:t>
+        </w:r>
+      </w:hyperlink>
+    </w:p>
+    <w:p>
+      <w:pPr>
+        <w:keepNext w:val="0"/>
+        <w:keepLines/>
+        <w:pageBreakBefore w:val="0"/>
+        <w:spacing w:line="480" w:lineRule="auto" w:before="0" w:after="0"/>
+        <w:ind w:left="720" w:hanging="720"/>
+      </w:pPr>
+      <w:r>
+        <w:rPr>
+          <w:color w:val="000000"/>
+        </w:rPr>
+        <w:t xml:space="preserve">Salesloft. (2026b, September 29). </w:t>
+      </w:r>
+      <w:r>
+        <w:rPr>
+          <w:i/>
+          <w:color w:val="000000"/>
+        </w:rPr>
+        <w:t>Conversation Intelligence: Call review page UI reference</w:t>
+      </w:r>
+      <w:r>
+        <w:rPr>
+          <w:color w:val="000000"/>
+        </w:rPr>
+        <w:t xml:space="preserve">. Retrieved October 23, 2026, from </w:t>
+      </w:r>
+      <w:hyperlink r:id="rId16">
+        <w:r>
+          <w:rPr>
+            <w:color w:val="000000"/>
+          </w:rPr>
+          <w:t>https://help.salesloft.com/s/article/Conversation-Intelligence-Call-Review-Page-UI-Reference?language=en_US</w:t>
+        </w:r>
+      </w:hyperlink>
+    </w:p>
+    <w:p>
+      <w:pPr>
+        <w:keepNext w:val="0"/>
+        <w:keepLines/>
+        <w:pageBreakBefore w:val="0"/>
+        <w:spacing w:line="480" w:lineRule="auto" w:before="0" w:after="0"/>
+        <w:ind w:left="720" w:hanging="720"/>
+      </w:pPr>
+      <w:r>
+        <w:rPr>
+          <w:color w:val="000000"/>
+        </w:rPr>
+        <w:t xml:space="preserve">Salesloft. (2026c, April 14). </w:t>
+      </w:r>
+      <w:r>
+        <w:rPr>
+          <w:i/>
+          <w:color w:val="000000"/>
+        </w:rPr>
+        <w:t>Conversations transcripts</w:t>
+      </w:r>
+      <w:r>
+        <w:rPr>
+          <w:color w:val="000000"/>
+        </w:rPr>
+        <w:t xml:space="preserve">. Retrieved October 23, 2026, from </w:t>
+      </w:r>
+      <w:hyperlink r:id="rId25">
+        <w:r>
+          <w:rPr>
+            <w:color w:val="000000"/>
+          </w:rPr>
+          <w:t>https://help.salesloft.com/s/article/Conversations-Transcripts?language=en_US</w:t>
+        </w:r>
+      </w:hyperlink>
+    </w:p>
+    <w:p>
+      <w:pPr>
+        <w:keepNext w:val="0"/>
+        <w:keepLines/>
+        <w:pageBreakBefore w:val="0"/>
+        <w:spacing w:line="480" w:lineRule="auto" w:before="0" w:after="0"/>
+        <w:ind w:left="720" w:hanging="720"/>
+      </w:pPr>
+      <w:r>
+        <w:rPr>
+          <w:color w:val="000000"/>
+        </w:rPr>
+        <w:t xml:space="preserve">Salesloft. (2026d, September 30). </w:t>
+      </w:r>
+      <w:r>
+        <w:rPr>
+          <w:i/>
+          <w:color w:val="000000"/>
         </w:rPr>
         <w:t>Integrate Salesforce with Conversation Intelligence</w:t>
       </w:r>
       <w:r>
         <w:rPr>
-          <w:rFonts w:ascii="Arial" w:hAnsi="Arial"/>
-          <w:i w:val="0"/>
           <w:color w:val="000000"/>
-          <w:sz w:val="22"/>
-          <w:sz w:val="22"/>
         </w:rPr>
-        <w:t xml:space="preserve">. </w:t>
-      </w:r>
-      <w:r>
-        <w:rPr>
-          <w:rFonts w:ascii="Arial" w:hAnsi="Arial"/>
-          <w:i w:val="0"/>
-          <w:color w:val="000000"/>
-          <w:sz w:val="22"/>
-          <w:sz w:val="22"/>
-        </w:rPr>
-        <w:t xml:space="preserve">Retrieved October 23, 2026, from </w:t>
+        <w:t xml:space="preserve">. Retrieved October 23, 2026, from </w:t>
       </w:r>
       <w:hyperlink r:id="rId19">
         <w:r>
           <w:rPr>
             <w:color w:val="000000"/>
-            <w:sz w:val="22"/>
           </w:rPr>
           <w:t>https://help.salesloft.com/s/article/Integrate-Salesforce-with-Conversation-Intelligence?language=en_US</w:t>
         </w:r>
@@ -8073,223 +8347,27 @@
       </w:pPr>
       <w:r>
         <w:rPr>
-          <w:rFonts w:ascii="Arial" w:hAnsi="Arial"/>
-          <w:i w:val="0"/>
           <w:color w:val="000000"/>
-          <w:sz w:val="22"/>
-          <w:sz w:val="22"/>
         </w:rPr>
-        <w:t xml:space="preserve">Salesloft. (2026a, July 14). </w:t>
+        <w:t xml:space="preserve">Salesloft. (2026e, October 1). </w:t>
       </w:r>
       <w:r>
         <w:rPr>
-          <w:rFonts w:ascii="Arial" w:hAnsi="Arial"/>
           <w:i/>
           <w:color w:val="000000"/>
-          <w:sz w:val="22"/>
-          <w:sz w:val="22"/>
-        </w:rPr>
-        <w:t>Clari + Salesloft defines the next era of AI conversation intelligence, turning buyer signals into revenue actions</w:t>
-      </w:r>
-      <w:r>
-        <w:rPr>
-          <w:rFonts w:ascii="Arial" w:hAnsi="Arial"/>
-          <w:i w:val="0"/>
-          <w:color w:val="000000"/>
-          <w:sz w:val="22"/>
-          <w:sz w:val="22"/>
-        </w:rPr>
-        <w:t xml:space="preserve"> [Press release]</w:t>
-      </w:r>
-      <w:r>
-        <w:rPr>
-          <w:rFonts w:ascii="Arial" w:hAnsi="Arial"/>
-          <w:i w:val="0"/>
-          <w:color w:val="000000"/>
-          <w:sz w:val="22"/>
-          <w:sz w:val="22"/>
-        </w:rPr>
-        <w:t xml:space="preserve">. </w:t>
-      </w:r>
-      <w:hyperlink r:id="rId12">
-        <w:r>
-          <w:rPr>
-            <w:color w:val="000000"/>
-            <w:sz w:val="22"/>
-          </w:rPr>
-          <w:t>https://www.salesloft.com/company/newsroom/salesloft-conversation-intelligence</w:t>
-        </w:r>
-      </w:hyperlink>
-    </w:p>
-    <w:p>
-      <w:pPr>
-        <w:keepNext w:val="0"/>
-        <w:keepLines/>
-        <w:pageBreakBefore w:val="0"/>
-        <w:spacing w:line="480" w:lineRule="auto" w:before="0" w:after="0"/>
-        <w:ind w:left="720" w:hanging="720"/>
-      </w:pPr>
-      <w:r>
-        <w:rPr>
-          <w:rFonts w:ascii="Arial" w:hAnsi="Arial"/>
-          <w:i w:val="0"/>
-          <w:color w:val="000000"/>
-          <w:sz w:val="22"/>
-          <w:sz w:val="22"/>
-        </w:rPr>
-        <w:t xml:space="preserve">Salesloft. (2026b, September 29). </w:t>
-      </w:r>
-      <w:r>
-        <w:rPr>
-          <w:rFonts w:ascii="Arial" w:hAnsi="Arial"/>
-          <w:i/>
-          <w:color w:val="000000"/>
-          <w:sz w:val="22"/>
-          <w:sz w:val="22"/>
-        </w:rPr>
-        <w:t>Conversation Intelligence: Call review page UI reference</w:t>
-      </w:r>
-      <w:r>
-        <w:rPr>
-          <w:rFonts w:ascii="Arial" w:hAnsi="Arial"/>
-          <w:i w:val="0"/>
-          <w:color w:val="000000"/>
-          <w:sz w:val="22"/>
-          <w:sz w:val="22"/>
-        </w:rPr>
-        <w:t xml:space="preserve">. </w:t>
-      </w:r>
-      <w:r>
-        <w:rPr>
-          <w:rFonts w:ascii="Arial" w:hAnsi="Arial"/>
-          <w:i w:val="0"/>
-          <w:color w:val="000000"/>
-          <w:sz w:val="22"/>
-          <w:sz w:val="22"/>
-        </w:rPr>
-        <w:t xml:space="preserve">Retrieved October 23, 2026, from </w:t>
-      </w:r>
-      <w:hyperlink r:id="rId16">
-        <w:r>
-          <w:rPr>
-            <w:color w:val="000000"/>
-            <w:sz w:val="22"/>
-          </w:rPr>
-          <w:t>https://help.salesloft.com/s/article/Conversation-Intelligence-Call-Review-Page-UI-Reference?language=en_US</w:t>
-        </w:r>
-      </w:hyperlink>
-    </w:p>
-    <w:p>
-      <w:pPr>
-        <w:keepNext w:val="0"/>
-        <w:keepLines/>
-        <w:pageBreakBefore w:val="0"/>
-        <w:spacing w:line="480" w:lineRule="auto" w:before="0" w:after="0"/>
-        <w:ind w:left="720" w:hanging="720"/>
-      </w:pPr>
-      <w:r>
-        <w:rPr>
-          <w:rFonts w:ascii="Arial" w:hAnsi="Arial"/>
-          <w:i w:val="0"/>
-          <w:color w:val="000000"/>
-          <w:sz w:val="22"/>
-          <w:sz w:val="22"/>
-        </w:rPr>
-        <w:t xml:space="preserve">Salesloft. (2026c, April 14). </w:t>
-      </w:r>
-      <w:r>
-        <w:rPr>
-          <w:rFonts w:ascii="Arial" w:hAnsi="Arial"/>
-          <w:i/>
-          <w:color w:val="000000"/>
-          <w:sz w:val="22"/>
-          <w:sz w:val="22"/>
-        </w:rPr>
-        <w:t>Conversations transcripts</w:t>
-      </w:r>
-      <w:r>
-        <w:rPr>
-          <w:rFonts w:ascii="Arial" w:hAnsi="Arial"/>
-          <w:i w:val="0"/>
-          <w:color w:val="000000"/>
-          <w:sz w:val="22"/>
-          <w:sz w:val="22"/>
-        </w:rPr>
-        <w:t xml:space="preserve">. </w:t>
-      </w:r>
-      <w:r>
-        <w:rPr>
-          <w:rFonts w:ascii="Arial" w:hAnsi="Arial"/>
-          <w:i w:val="0"/>
-          <w:color w:val="000000"/>
-          <w:sz w:val="22"/>
-          <w:sz w:val="22"/>
-        </w:rPr>
-        <w:t xml:space="preserve">Retrieved October 23, 2026, from </w:t>
-      </w:r>
-      <w:hyperlink r:id="rId25">
-        <w:r>
-          <w:rPr>
-            <w:color w:val="000000"/>
-            <w:sz w:val="22"/>
-          </w:rPr>
-          <w:t>https://help.salesloft.com/s/article/Conversations-Transcripts?language=en_US</w:t>
-        </w:r>
-      </w:hyperlink>
-    </w:p>
-    <w:p>
-      <w:pPr>
-        <w:keepNext w:val="0"/>
-        <w:keepLines/>
-        <w:pageBreakBefore w:val="0"/>
-        <w:spacing w:line="480" w:lineRule="auto" w:before="0" w:after="0"/>
-        <w:ind w:left="720" w:hanging="720"/>
-      </w:pPr>
-      <w:r>
-        <w:rPr>
-          <w:rFonts w:ascii="Arial" w:hAnsi="Arial"/>
-          <w:i w:val="0"/>
-          <w:color w:val="000000"/>
-          <w:sz w:val="22"/>
-          <w:sz w:val="22"/>
-        </w:rPr>
-        <w:t xml:space="preserve">Salesloft. (2026d, October 1). </w:t>
-      </w:r>
-      <w:r>
-        <w:rPr>
-          <w:rFonts w:ascii="Arial" w:hAnsi="Arial"/>
-          <w:i/>
-          <w:color w:val="000000"/>
-          <w:sz w:val="22"/>
-          <w:sz w:val="22"/>
         </w:rPr>
         <w:t>Set up topics and filters in Conversation Intelligence</w:t>
       </w:r>
       <w:r>
         <w:rPr>
-          <w:rFonts w:ascii="Arial" w:hAnsi="Arial"/>
-          <w:i w:val="0"/>
           <w:color w:val="000000"/>
-          <w:sz w:val="22"/>
-          <w:sz w:val="22"/>
         </w:rPr>
-        <w:t xml:space="preserve">. </w:t>
-      </w:r>
-      <w:r>
-        <w:rPr>
-          <w:rFonts w:ascii="Arial" w:hAnsi="Arial"/>
-          <w:i w:val="0"/>
-          <w:color w:val="000000"/>
-          <w:sz w:val="22"/>
-          <w:sz w:val="22"/>
-        </w:rPr>
-        <w:t xml:space="preserve">Retrieved October 23, 2026, from </w:t>
+        <w:t xml:space="preserve">. Retrieved October 23, 2026, from </w:t>
       </w:r>
       <w:hyperlink r:id="rId22">
         <w:r>
           <w:rPr>
             <w:color w:val="000000"/>
-            <w:sz w:val="22"/>
           </w:rPr>
           <w:t>https://help.salesloft.com/s/article/Set-Up-Topics-and-Filters-in-Conversation-Intelligence?language=en_US</w:t>
         </w:r>
@@ -8655,7 +8733,7 @@
         <w:sz w:val="16"/>
         <w:color w:val="000000"/>
       </w:rPr>
-      <w:t xml:space="preserve">22 October 2026  |  </w:t>
+      <w:t xml:space="preserve">23 October 2026  |  </w:t>
     </w:r>
     <w:fldSimple w:instr="PAGE"/>
   </w:p>

</xml_diff>

<commit_message>
SASTT-8 Correct Diasbek surname in the Word report
</commit_message>
<xml_diff>
--- a/docs/research_and_design.docx
+++ b/docs/research_and_design.docx
@@ -406,7 +406,7 @@
                 <w:color w:val="000000"/>
                 <w:sz w:val="19"/>
               </w:rPr>
-              <w:t>Amangeldiev Diasbek Yernarovich</w:t>
+              <w:t>Amangeldiyev Diasbek Yernarovich</w:t>
             </w:r>
           </w:p>
         </w:tc>
@@ -5405,7 +5405,7 @@
                 <w:color w:val="000000"/>
                 <w:sz w:val="19"/>
               </w:rPr>
-              <w:t>Amangeldiev Diasbek Yernarovich</w:t>
+              <w:t>Amangeldiyev Diasbek Yernarovich</w:t>
             </w:r>
           </w:p>
         </w:tc>

</xml_diff>